<commit_message>
Point the published URL at the DataVisA3 repo, and pin poppler-utils
</commit_message>
<xml_diff>
--- a/out/24503993_A3.docx
+++ b/out/24503993_A3.docx
@@ -39,7 +39,7 @@
           <w:color w:val="52514E"/>
           <w:sz w:val="19"/>
         </w:rPr>
-        <w:t>32146 Visual Analytics, Assessment Task 3. Student 24503993. Dashboard and storyboard: https://toms55.github.io/datavis-a3/</w:t>
+        <w:t>32146 Visual Analytics, Assessment Task 3. Student 24503993. Dashboard and storyboard: https://toms55.github.io/DataVisA3/</w:t>
       </w:r>
     </w:p>
     <w:p>
@@ -2073,7 +2073,7 @@
         <w:spacing w:after="100"/>
       </w:pPr>
       <w:r>
-        <w:t>The dashboard is at https://toms55.github.io/datavis-a3/dashboard.html and covers subcategory 33 in both directions on one screen. It carries a six tile summary row, five named comparisons, an insight for each of the ten years, and a year range control that re-scales every time chart at once. Each chart has a collapsible table of the numbers beneath it.</w:t>
+        <w:t>The dashboard is at https://toms55.github.io/DataVisA3/dashboard.html and covers subcategory 33 in both directions on one screen. It carries a six tile summary row, five named comparisons, an insight for each of the ten years, and a year range control that re-scales every time chart at once. Each chart has a collapsible table of the numbers beneath it.</w:t>
       </w:r>
     </w:p>
     <w:p>
@@ -2284,7 +2284,7 @@
         <w:spacing w:after="100"/>
       </w:pPr>
       <w:r>
-        <w:t>The storyboard is at https://toms55.github.io/datavis-a3/storyboard.html. Where the dashboard answers questions in any order, the storyboard makes one argument in a fixed order across thirteen panels. It starts with total Australian trade, moves through the ten main categories in their raw, indexed and statistical forms, works through the change point of each year, descends into main category 3, then into subcategory 33, and closes with the forecast and the AI comparison. Every panel carries both trade directions and ends with a stated takeaway, so a reader cannot reach the end without having been told what each chart is for.</w:t>
+        <w:t>The storyboard is at https://toms55.github.io/DataVisA3/storyboard.html. Where the dashboard answers questions in any order, the storyboard makes one argument in a fixed order across thirteen panels. It starts with total Australian trade, moves through the ten main categories in their raw, indexed and statistical forms, works through the change point of each year, descends into main category 3, then into subcategory 33, and closes with the forecast and the AI comparison. Every panel carries both trade directions and ends with a stated takeaway, so a reader cannot reach the end without having been told what each chart is for.</w:t>
       </w:r>
     </w:p>
     <w:p>

</xml_diff>

<commit_message>
fix bug in graph idx
</commit_message>
<xml_diff>
--- a/out/24503993_A3.docx
+++ b/out/24503993_A3.docx
@@ -77,7 +77,7 @@
         <w:spacing w:after="100"/>
       </w:pPr>
       <w:r>
-        <w:t>Subcategory 33, petroleum, is the only large part of Australian trade where the country buys far more than it sells. Export grew 104% across the decade and import grew 126%, so the deficit widened from $16,369m to $38,555m. Import and export move together at a correlation of 0.91, because both are priced off the same world oil market. Import is about three times the size of export, so every oil price rise widens the deficit rather than closing it. Australia cannot export its way out of this gap.</w:t>
+        <w:t>Subcategory 33, petroleum, is the only large part of Australian trade where the country buys far more than it sells. Export grew 104% across the decade and import grew 126%, so the deficit widened from $16,369m to $38,555m. Import and export move together at a correlation of 0.91, because both are priced off the same world oil market. Import is 3.72 times the size of export, so every oil price rise widens the deficit rather than closing it. Australia cannot export its way out of this gap.</w:t>
       </w:r>
     </w:p>
     <w:p>
@@ -240,7 +240,7 @@
         <w:spacing w:after="100"/>
       </w:pPr>
       <w:r>
-        <w:t>The workbook holds 23 sheets and 19 native Excel time series charts. Each chart carries a title and a label on both axes. The analysis sheets are these.</w:t>
+        <w:t>The workbook holds 24 sheets and 19 native Excel time series charts. Each chart carries a title and a label on both axes. The analysis sheets are these.</w:t>
       </w:r>
     </w:p>
     <w:tbl>
@@ -993,7 +993,7 @@
         <w:spacing w:after="100"/>
       </w:pPr>
       <w:r>
-        <w:t>The export mix shifted and the import mix did not. Category 2 rose to 34.5% of all export by 2025. On the import side category 7 held about 41% across the whole decade. Australia changed what it sells considerably more than it changed what it buys.</w:t>
+        <w:t>The export mix shifted and the import mix did not. Category 2 rose to 34.5% of all export by 2025. On the import side category 7 moved only from 40.6% to 41.4%, inside a decade range of 37.6% to 42.0%. Australia changed what it sells and did not change what it buys.</w:t>
       </w:r>
     </w:p>
     <w:p>
@@ -1331,7 +1331,7 @@
                 <w:rFonts w:ascii="Liberation Sans" w:hAnsi="Liberation Sans"/>
                 <w:sz w:val="18"/>
               </w:rPr>
-              <w:t>Mineral fuels export rises 23,447 million on higher coal and LNG prices and new LNG capacity.</w:t>
+              <w:t>Higher coal and LNG prices, and new LNG capacity.</w:t>
             </w:r>
           </w:p>
         </w:tc>
@@ -1393,7 +1393,7 @@
                 <w:rFonts w:ascii="Liberation Sans" w:hAnsi="Liberation Sans"/>
                 <w:sz w:val="18"/>
               </w:rPr>
-              <w:t>Mineral fuels export rises 31,120 million as LNG output reaches full capacity.</w:t>
+              <w:t>LNG output reaches full capacity.</w:t>
             </w:r>
           </w:p>
         </w:tc>
@@ -1455,7 +1455,7 @@
                 <w:rFonts w:ascii="Liberation Sans" w:hAnsi="Liberation Sans"/>
                 <w:sz w:val="18"/>
               </w:rPr>
-              <w:t>Crude materials export rises 29,536 million.</w:t>
+              <w:t>Iron ore rises 32,099 million after a supply shock cut Brazilian output.</w:t>
             </w:r>
           </w:p>
         </w:tc>
@@ -1517,7 +1517,7 @@
                 <w:rFonts w:ascii="Liberation Sans" w:hAnsi="Liberation Sans"/>
                 <w:sz w:val="18"/>
               </w:rPr>
-              <w:t>COVID cuts mineral fuels export 37,467 million and mineral fuels import 15,686 million.</w:t>
+              <w:t>COVID cuts demand.</w:t>
             </w:r>
           </w:p>
         </w:tc>
@@ -1579,7 +1579,7 @@
                 <w:rFonts w:ascii="Liberation Sans" w:hAnsi="Liberation Sans"/>
                 <w:sz w:val="18"/>
               </w:rPr>
-              <w:t>Crude materials export rises 46,211 million at the iron ore price peak.</w:t>
+              <w:t>The iron ore price peaks.</w:t>
             </w:r>
           </w:p>
         </w:tc>
@@ -1641,7 +1641,7 @@
                 <w:rFonts w:ascii="Liberation Sans" w:hAnsi="Liberation Sans"/>
                 <w:sz w:val="18"/>
               </w:rPr>
-              <w:t>Mineral fuels export rises 124,939 million after the invasion of Ukraine.</w:t>
+              <w:t>The invasion of Ukraine.</w:t>
             </w:r>
           </w:p>
         </w:tc>
@@ -1703,7 +1703,7 @@
                 <w:rFonts w:ascii="Liberation Sans" w:hAnsi="Liberation Sans"/>
                 <w:sz w:val="18"/>
               </w:rPr>
-              <w:t>Mineral fuels export falls 55,785 million as energy prices retreat from the 2022 peak.</w:t>
+              <w:t>Energy prices retreat from the 2022 peak.</w:t>
             </w:r>
           </w:p>
         </w:tc>
@@ -1765,7 +1765,7 @@
                 <w:rFonts w:ascii="Liberation Sans" w:hAnsi="Liberation Sans"/>
                 <w:sz w:val="18"/>
               </w:rPr>
-              <w:t>Mineral fuels export falls 24,707 million and crude materials export falls 23,373 million as energy and iron ore prices both ease.</w:t>
+              <w:t>Energy and iron ore prices both ease.</w:t>
             </w:r>
           </w:p>
         </w:tc>
@@ -1827,7 +1827,7 @@
                 <w:rFonts w:ascii="Liberation Sans" w:hAnsi="Liberation Sans"/>
                 <w:sz w:val="18"/>
               </w:rPr>
-              <w:t>Mineral fuels export falls 30,661 million.</w:t>
+              <w:t>Category 9 rises 21,245 million, and gold alone accounts for 23,854 million of that.</w:t>
             </w:r>
           </w:p>
         </w:tc>
@@ -2035,7 +2035,7 @@
         <w:spacing w:after="100"/>
       </w:pPr>
       <w:r>
-        <w:t>The export side and the import side are different categories in practice. On export, petroleum is only 10.1% of category 3 in 2025, behind both coal and gas. On import, petroleum is 99.0% of the category, because Australia imports almost no coal and almost no gas. Any statement about "category 3 imports" is in effect a statement about petroleum alone.</w:t>
+        <w:t>The export side and the import side are different categories in practice. On export, petroleum is only 10.1% of category 3 in 2025, behind both coal and gas. On import, petroleum is 99.0% of the category, against 0.4% for coal and 0.6% for gas. Any statement about "category 3 imports" is a statement about petroleum alone.</w:t>
       </w:r>
     </w:p>
     <w:p>
@@ -2346,7 +2346,7 @@
         <w:spacing w:after="100"/>
       </w:pPr>
       <w:r>
-        <w:t>This is the panel that sets up everything after it. The balance grew from $4,124m in 2016 to $176,863m in 2022, then fell to $62,232m by 2025. Export retreated from its 2022 peak while import carried on rising without a pause. The surplus is narrowing from both ends.</w:t>
+        <w:t>This panel sets up every panel after it. Export fell 12% from its 2022 peak while import reached its decade high of $460,866m in the same year, rising in 7 of the nine transitions. The surplus quoted in section 1 narrows from both ends at once, which no single series on the chart shows on its own.</w:t>
       </w:r>
     </w:p>
     <w:p>
@@ -2916,7 +2916,7 @@
         <w:spacing w:after="100"/>
       </w:pPr>
       <w:r>
-        <w:t>This chart carries the central finding. The two directions move together at r = 0.91. Both are priced off the same world oil market, so they rise and fall as one. Because import is about three times the size of export, a price rise adds roughly three dollars to the import bill for every dollar it adds to export earnings. Growing petroleum export cannot close this gap. Only buying less, or refining more at home, can.</w:t>
+        <w:t>This chart carries the central finding. The two directions move together at r = 0.91. Both are priced off the same world oil market, so they rise and fall as one. Because import is 3.72 times the size of export, a price rise adds $3.72 to the import bill for every dollar it adds to export earnings. Growing petroleum export cannot close this gap. Only buying less, or refining more at home, can.</w:t>
       </w:r>
     </w:p>
     <w:p>
@@ -3516,7 +3516,7 @@
         <w:spacing w:after="100"/>
       </w:pPr>
       <w:r>
-        <w:t>The AI did two things. It described the decade, and it forecast each year from 2026 to 2030. Its description was accurate. It found the 2022 peak of 65,082, the 2020 dip to 22,720, and the three year decline to 52,742 in 2025, and it noted that 2025 is still more than double the 2016 level. It also stated its method, which was to extrapolate the 2022 to 2025 fall of about 4,113 million a year. A reader can therefore check it. None of that is trivial, and it took a few seconds.</w:t>
+        <w:t>The AI did two things. It described the decade, and it forecast each year from 2026 to 2030. Its description was accurate. It found the 2022 peak of 65,082, the 2020 dip to 22,720, and the three year decline to 52,742 in 2025, and it noted that 2025 is still more than double the 2016 level. It also stated its method, which was to extrapolate the 2022 to 2025 fall of 4,113 million a year. A reader can therefore check it.</w:t>
       </w:r>
     </w:p>
     <w:p>
@@ -4162,7 +4162,7 @@
           <w:rFonts w:ascii="Liberation Sans" w:hAnsi="Liberation Sans"/>
           <w:sz w:val="21"/>
         </w:rPr>
-        <w:t>1.  Speed. The analysis arrived in seconds, against roughly a day of work for the spreadsheet and the charts.</w:t>
+        <w:t>1.  Speed. The reply returned in seconds and needed no spreadsheet, no chart and no build step.</w:t>
       </w:r>
     </w:p>
     <w:p>
@@ -4188,7 +4188,7 @@
           <w:rFonts w:ascii="Liberation Sans" w:hAnsi="Liberation Sans"/>
           <w:sz w:val="21"/>
         </w:rPr>
-        <w:t>3.  A stated method. It said it was extrapolating the 2022 to 2025 fall at about 4,113 a year. Because it said so, the method could be backtested and found wanting. An assistant that only returned numbers would have been useless here.</w:t>
+        <w:t>3.  A stated method. It said it was extrapolating the 2022 to 2025 fall at 4,113 a year. Because it said so, the method could be backtested and found wanting. An assistant that only returned numbers would have been useless here.</w:t>
       </w:r>
     </w:p>
     <w:p>
@@ -4302,7 +4302,7 @@
         <w:spacing w:after="100"/>
       </w:pPr>
       <w:r>
-        <w:t>The honest conclusion is that neither forecast deserves confidence, and the backtest shows why: this series is driven by a world price and is not forecastable from its own history. The AI was most valuable not as a forecaster but as an adversary. It made a different defensible choice, which forced me to test a choice I had not examined. Used that way, as a second opinion whose method is stated and then checked, it improved the analysis. Used the way it presents itself, as five confident numbers, it would have made the analysis worse than having no forecast at all.</w:t>
+        <w:t>The AI was useful here as an adversary, not as a forecaster. It made a different defensible choice of window, which forced me to backtest a choice I had not examined. A second opinion whose method is stated and then measured improves the analysis. The same output read at face value, as five confident numbers, would have made it worse than having no forecast at all.</w:t>
       </w:r>
     </w:p>
     <w:p>
@@ -4350,7 +4350,7 @@
           <w:rFonts w:ascii="Liberation Sans" w:hAnsi="Liberation Sans"/>
           <w:sz w:val="21"/>
         </w:rPr>
-        <w:t>2.  Different magnitudes on one chart. Category 4 is about one hundredth the size of category 2. A second y axis was rejected, because two scales on one frame invite false comparison. Indexing to 2016 and small multiples solved it honestly.</w:t>
+        <w:t>2.  Different magnitudes on one chart. Category 4 export is $1,806m against $180,651m for category 2, a ratio of 1 to 100. A second y axis was rejected, because two scales on one frame invite false comparison. Indexing to 2016 and small multiples solved it honestly.</w:t>
       </w:r>
     </w:p>
     <w:p>
@@ -4760,7 +4760,7 @@
           <w:rFonts w:ascii="Liberation Sans" w:hAnsi="Liberation Sans"/>
           <w:sz w:val="21"/>
         </w:rPr>
-        <w:t>2.  Do not pursue petroleum export growth as a fuel security measure. Import and export move together at r = 0.91 and import is about three times larger, so a higher oil price widens the deficit no matter how much Australia sells. This is the single clearest policy finding in the data.</w:t>
+        <w:t>2.  Do not pursue petroleum export growth as a fuel security measure. Import and export move together at r = 0.91 and import is 3.72 times larger, so a higher oil price widens the deficit no matter how much Australia sells. This is the single clearest policy finding in the data.</w:t>
       </w:r>
     </w:p>
     <w:p>
@@ -4834,7 +4834,7 @@
         <w:spacing w:after="100"/>
       </w:pPr>
       <w:r>
-        <w:t>Ten years of Australian trade data show a surplus that peaked on a price shock and has fallen 65% since. Underneath it, subcategory 33 runs the other way. Australia buys far more petroleum than it sells, the gap has more than doubled, and the two sides of that trade move together closely enough that selling more cannot fix it. The analysis in this report is reproducible: every number lives in the submitted workbook as a formula, and the dashboard, the storyboard and this report all read that one file.</w:t>
+        <w:t>The decade surplus peaked on a price shock and has fallen 65% since. Subcategory 33 runs the other way, and section 11 shows why selling more petroleum cannot close it. One decision follows: track the import bill against a target, because the backtest in section 12.3 shows no method here forecasts this series. Every number above lives in the submitted workbook as a live formula, and the report, the dashboard and the storyboard all read that one file.</w:t>
       </w:r>
     </w:p>
     <w:p>
@@ -4909,9 +4909,9 @@
         <w:t>2025 52742</w:t>
         <w:br/>
         <w:br/>
-        <w:t>Do two things. Keep the whole answer under 200 words. Answer directly from the</w:t>
+        <w:t>Do two things. Keep the whole answer under 200 words. Answer directly from the numbers</w:t>
         <w:br/>
-        <w:t>numbers given. Do not use any tools.</w:t>
+        <w:t>given. Do not use any tools.</w:t>
         <w:br/>
         <w:br/>
         <w:t>1. Describe the trend between 2016 and 2025.</w:t>

</xml_diff>

<commit_message>
Tighten the report: exact figures in place of hedges, and cut repeated content
Also filter the balance chart with the year control.
</commit_message>
<xml_diff>
--- a/out/24503993_A3.docx
+++ b/out/24503993_A3.docx
@@ -1827,7 +1827,7 @@
                 <w:rFonts w:ascii="Liberation Sans" w:hAnsi="Liberation Sans"/>
                 <w:sz w:val="18"/>
               </w:rPr>
-              <w:t>Category 9 rises 21,245 million, and gold alone accounts for 23,854 million of that.</w:t>
+              <w:t>Energy prices keep easing for a third year.</w:t>
             </w:r>
           </w:p>
         </w:tc>
@@ -2262,7 +2262,7 @@
         <w:spacing w:after="100"/>
       </w:pPr>
       <w:r>
-        <w:t>The deficit widened from $16,369m in 2016 to $38,555m in 2025, and reached its worst point of $47,741m in 2022. The cover ratio in 2025 is 0.27, which means each dollar of petroleum import is matched by 27 cents of petroleum export.</w:t>
+        <w:t>The deficit reached its worst point of $47,741m in 2022, which is 1.24 times the 2025 figure. The cover ratio in 2025 is 0.27, so each dollar of petroleum import is matched by 27 cents of petroleum export.</w:t>
       </w:r>
     </w:p>
     <w:p>
@@ -2346,7 +2346,7 @@
         <w:spacing w:after="100"/>
       </w:pPr>
       <w:r>
-        <w:t>This panel sets up every panel after it. Export fell 12% from its 2022 peak while import reached its decade high of $460,866m in the same year, rising in 7 of the nine transitions. The surplus quoted in section 1 narrows from both ends at once, which no single series on the chart shows on its own.</w:t>
+        <w:t>This panel sets up every panel after it. Export fell 12% from its 2022 peak, while import rose in 7 of the nine transitions and set its decade high of $460,866m in 2025. The surplus quoted in section 1 narrows from both ends at once, which no single series on the chart shows on its own.</w:t>
       </w:r>
     </w:p>
     <w:p>

</xml_diff>